<commit_message>
pierwsza z wielu poprawek
</commit_message>
<xml_diff>
--- a/raport.docx
+++ b/raport.docx
@@ -1,74 +1,17 @@
 
 <file path=word/document.xml><?xml version="1.0" encoding="utf-8"?>
-<w:document xmlns:wpc="http://schemas.microsoft.com/office/word/2010/wordprocessingCanvas" xmlns:cx="http://schemas.microsoft.com/office/drawing/2014/chartex" xmlns:cx1="http://schemas.microsoft.com/office/drawing/2015/9/8/chartex" xmlns:cx2="http://schemas.microsoft.com/office/drawing/2015/10/21/chartex" xmlns:cx3="http://schemas.microsoft.com/office/drawing/2016/5/9/chartex" xmlns:cx4="http://schemas.microsoft.com/office/drawing/2016/5/10/chartex" xmlns:cx5="http://schemas.microsoft.com/office/drawing/2016/5/11/chartex" xmlns:cx6="http://schemas.microsoft.com/office/drawing/2016/5/12/chartex" xmlns:cx7="http://schemas.microsoft.com/office/drawing/2016/5/13/chartex" xmlns:cx8="http://schemas.microsoft.com/office/drawing/2016/5/14/chartex" xmlns:mc="http://schemas.openxmlformats.org/markup-compatibility/2006" xmlns:aink="http://schemas.microsoft.com/office/drawing/2016/ink" xmlns:am3d="http://schemas.microsoft.com/office/drawing/2017/model3d" xmlns:o="urn:schemas-microsoft-com:office:office" xmlns:oel="http://schemas.microsoft.com/office/2019/extlst" xmlns:r="http://schemas.openxmlformats.org/officeDocument/2006/relationships" xmlns:m="http://schemas.openxmlformats.org/officeDocument/2006/math" xmlns:v="urn:schemas-microsoft-com:vml" xmlns:wp14="http://schemas.microsoft.com/office/word/2010/wordprocessingDrawing" xmlns:wp="http://schemas.openxmlformats.org/drawingml/2006/wordprocessingDrawing" xmlns:w10="urn:schemas-microsoft-com:office:word" xmlns:w="http://schemas.openxmlformats.org/wordprocessingml/2006/main" xmlns:w14="http://schemas.microsoft.com/office/word/2010/wordml" xmlns:w15="http://schemas.microsoft.com/office/word/2012/wordml" xmlns:w16cex="http://schemas.microsoft.com/office/word/2018/wordml/cex" xmlns:w16cid="http://schemas.microsoft.com/office/word/2016/wordml/cid" xmlns:w16="http://schemas.microsoft.com/office/word/2018/wordml" xmlns:w16sdtdh="http://schemas.microsoft.com/office/word/2020/wordml/sdtdatahash" xmlns:w16se="http://schemas.microsoft.com/office/word/2015/wordml/symex" xmlns:wpg="http://schemas.microsoft.com/office/word/2010/wordprocessingGroup" xmlns:wpi="http://schemas.microsoft.com/office/word/2010/wordprocessingInk" xmlns:wne="http://schemas.microsoft.com/office/word/2006/wordml" xmlns:wps="http://schemas.microsoft.com/office/word/2010/wordprocessingShape" mc:Ignorable="w14 w15 w16se w16cid w16 w16cex w16sdtdh wp14">
+<w:document xmlns:wpc="http://schemas.microsoft.com/office/word/2010/wordprocessingCanvas" xmlns:cx="http://schemas.microsoft.com/office/drawing/2014/chartex" xmlns:cx1="http://schemas.microsoft.com/office/drawing/2015/9/8/chartex" xmlns:cx2="http://schemas.microsoft.com/office/drawing/2015/10/21/chartex" xmlns:cx3="http://schemas.microsoft.com/office/drawing/2016/5/9/chartex" xmlns:cx4="http://schemas.microsoft.com/office/drawing/2016/5/10/chartex" xmlns:cx5="http://schemas.microsoft.com/office/drawing/2016/5/11/chartex" xmlns:cx6="http://schemas.microsoft.com/office/drawing/2016/5/12/chartex" xmlns:cx7="http://schemas.microsoft.com/office/drawing/2016/5/13/chartex" xmlns:cx8="http://schemas.microsoft.com/office/drawing/2016/5/14/chartex" xmlns:mc="http://schemas.openxmlformats.org/markup-compatibility/2006" xmlns:aink="http://schemas.microsoft.com/office/drawing/2016/ink" xmlns:am3d="http://schemas.microsoft.com/office/drawing/2017/model3d" xmlns:o="urn:schemas-microsoft-com:office:office" xmlns:r="http://schemas.openxmlformats.org/officeDocument/2006/relationships" xmlns:m="http://schemas.openxmlformats.org/officeDocument/2006/math" xmlns:v="urn:schemas-microsoft-com:vml" xmlns:wp14="http://schemas.microsoft.com/office/word/2010/wordprocessingDrawing" xmlns:wp="http://schemas.openxmlformats.org/drawingml/2006/wordprocessingDrawing" xmlns:w10="urn:schemas-microsoft-com:office:word" xmlns:w="http://schemas.openxmlformats.org/wordprocessingml/2006/main" xmlns:w14="http://schemas.microsoft.com/office/word/2010/wordml" xmlns:w15="http://schemas.microsoft.com/office/word/2012/wordml" xmlns:w16cex="http://schemas.microsoft.com/office/word/2018/wordml/cex" xmlns:w16cid="http://schemas.microsoft.com/office/word/2016/wordml/cid" xmlns:w16="http://schemas.microsoft.com/office/word/2018/wordml" xmlns:w16sdtdh="http://schemas.microsoft.com/office/word/2020/wordml/sdtdatahash" xmlns:w16se="http://schemas.microsoft.com/office/word/2015/wordml/symex" xmlns:wpg="http://schemas.microsoft.com/office/word/2010/wordprocessingGroup" xmlns:wpi="http://schemas.microsoft.com/office/word/2010/wordprocessingInk" xmlns:wne="http://schemas.microsoft.com/office/word/2006/wordml" xmlns:wps="http://schemas.microsoft.com/office/word/2010/wordprocessingShape" mc:Ignorable="w14 w15 w16se w16cid w16 w16cex w16sdtdh wp14">
   <w:body>
     <w:p>
       <w:pPr>
         <w:pStyle w:val="Nagwek1"/>
       </w:pPr>
-      <w:proofErr w:type="spellStart"/>
       <w:r>
         <w:rPr>
           <w:color w:val="1A5C96"/>
           <w:sz w:val="36"/>
         </w:rPr>
-        <w:t>Prognoza</w:t>
-      </w:r>
-      <w:proofErr w:type="spellEnd"/>
-      <w:r>
-        <w:rPr>
-          <w:color w:val="1A5C96"/>
-          <w:sz w:val="36"/>
-        </w:rPr>
-        <w:t xml:space="preserve"> </w:t>
-      </w:r>
-      <w:proofErr w:type="spellStart"/>
-      <w:r>
-        <w:rPr>
-          <w:color w:val="1A5C96"/>
-          <w:sz w:val="36"/>
-        </w:rPr>
-        <w:t>zużycia</w:t>
-      </w:r>
-      <w:proofErr w:type="spellEnd"/>
-      <w:r>
-        <w:rPr>
-          <w:color w:val="1A5C96"/>
-          <w:sz w:val="36"/>
-        </w:rPr>
-        <w:t xml:space="preserve"> </w:t>
-      </w:r>
-      <w:proofErr w:type="spellStart"/>
-      <w:r>
-        <w:rPr>
-          <w:color w:val="1A5C96"/>
-          <w:sz w:val="36"/>
-        </w:rPr>
-        <w:t>energii</w:t>
-      </w:r>
-      <w:proofErr w:type="spellEnd"/>
-      <w:r>
-        <w:rPr>
-          <w:color w:val="1A5C96"/>
-          <w:sz w:val="36"/>
-        </w:rPr>
-        <w:t xml:space="preserve"> </w:t>
-      </w:r>
-      <w:proofErr w:type="spellStart"/>
-      <w:r>
-        <w:rPr>
-          <w:color w:val="1A5C96"/>
-          <w:sz w:val="36"/>
-        </w:rPr>
-        <w:t>elektrycznej</w:t>
-      </w:r>
-      <w:proofErr w:type="spellEnd"/>
-      <w:r>
-        <w:rPr>
-          <w:color w:val="1A5C96"/>
-          <w:sz w:val="36"/>
-        </w:rPr>
-        <w:t xml:space="preserve"> w Polsce</w:t>
+        <w:t>Prognoza zużycia energii elektrycznej w Polsce</w:t>
       </w:r>
     </w:p>
     <w:p>
@@ -84,7 +27,6 @@
       </w:r>
     </w:p>
     <w:p>
-      <w:proofErr w:type="spellStart"/>
       <w:r>
         <w:rPr>
           <w:b/>
@@ -97,7 +39,6 @@
         </w:rPr>
         <w:t>zy</w:t>
       </w:r>
-      <w:proofErr w:type="spellEnd"/>
       <w:r>
         <w:rPr>
           <w:b/>
@@ -105,31 +46,10 @@
         <w:t>:</w:t>
       </w:r>
       <w:r>
-        <w:t xml:space="preserve"> Patryk </w:t>
-      </w:r>
-      <w:proofErr w:type="spellStart"/>
-      <w:r>
-        <w:t>Siuda</w:t>
-      </w:r>
-      <w:proofErr w:type="spellEnd"/>
-      <w:r>
-        <w:t xml:space="preserve">, </w:t>
-      </w:r>
-      <w:proofErr w:type="spellStart"/>
-      <w:r>
-        <w:t>Paweł</w:t>
-      </w:r>
-      <w:proofErr w:type="spellEnd"/>
-      <w:r>
-        <w:t xml:space="preserve"> </w:t>
-      </w:r>
-      <w:proofErr w:type="spellStart"/>
-      <w:r>
-        <w:t>Cyrocki</w:t>
-      </w:r>
-      <w:proofErr w:type="spellEnd"/>
-      <w:r>
-        <w:t>, Damian Skinder</w:t>
+        <w:t xml:space="preserve"> Patryk Siuda</w:t>
+      </w:r>
+      <w:r>
+        <w:t>, Paweł Cyrocki, Damian Skinder</w:t>
       </w:r>
     </w:p>
     <w:p>
@@ -137,21 +57,16 @@
         <w:rPr>
           <w:b/>
         </w:rPr>
-        <w:t>Data:</w:t>
-      </w:r>
-      <w:r>
-        <w:t xml:space="preserve"> czerwiec 2026  </w:t>
-      </w:r>
-    </w:p>
-    <w:p>
+        <w:t>Kierunek</w:t>
+      </w:r>
       <w:r>
         <w:rPr>
           <w:b/>
         </w:rPr>
-        <w:t>Dane:</w:t>
-      </w:r>
-      <w:r>
-        <w:t xml:space="preserve"> 2004–2024 (GUS, URE, IMGW/Eurostat)</w:t>
+        <w:t>:</w:t>
+      </w:r>
+      <w:r>
+        <w:t xml:space="preserve"> Analityka gospodarcza II - online</w:t>
       </w:r>
     </w:p>
     <w:p>
@@ -182,7 +97,10 @@
         <w:t>prognozy warunkowej</w:t>
       </w:r>
       <w:r>
-        <w:t xml:space="preserve"> zużycia energii elektrycznej w Polsce na rok 2025, przy wykorzystaniu modeli ekonometrycznych estymowanych na danych historycznych z lat 2004–2024.</w:t>
+        <w:t xml:space="preserve"> zużycia energii elektrycznej w Polsce na rok 2025, przy wykorzystaniu modeli ekonometrycznych estymowa</w:t>
+      </w:r>
+      <w:r>
+        <w:t>nych na danych historycznych z lat 2004–2024.</w:t>
       </w:r>
     </w:p>
     <w:p>
@@ -195,7 +113,7 @@
         <w:pStyle w:val="Listapunktowana"/>
       </w:pPr>
       <w:r>
-        <w:t>Analiza opisowa danych (EDA) – zadanie 2</w:t>
+        <w:t xml:space="preserve">Analiza opisowa danych </w:t>
       </w:r>
     </w:p>
     <w:p>
@@ -203,7 +121,7 @@
         <w:pStyle w:val="Listapunktowana"/>
       </w:pPr>
       <w:r>
-        <w:t>Budowa i weryfikacja modeli ekonometrycznych – zadanie 3</w:t>
+        <w:t xml:space="preserve">Budowa i weryfikacja modeli ekonometrycznych </w:t>
       </w:r>
     </w:p>
     <w:p>
@@ -211,7 +129,7 @@
         <w:pStyle w:val="Listapunktowana"/>
       </w:pPr>
       <w:r>
-        <w:t>Prognozy zmiennych objaśniających (7 metod) – zadanie 4</w:t>
+        <w:t xml:space="preserve">Prognozy zmiennych objaśniających </w:t>
       </w:r>
     </w:p>
     <w:p>
@@ -219,7 +137,10 @@
         <w:pStyle w:val="Listapunktowana"/>
       </w:pPr>
       <w:r>
-        <w:t>Prognoza warunkowa zmiennej objaśnianej – zadanie 5</w:t>
+        <w:t>Prognoza waru</w:t>
+      </w:r>
+      <w:r>
+        <w:t>nkowa zmiennej objaśnianej</w:t>
       </w:r>
     </w:p>
     <w:p>
@@ -291,7 +212,13 @@
         <w:rPr>
           <w:b/>
         </w:rPr>
-        <w:t>kroczącej prognozy 1-krokowej naprzód</w:t>
+        <w:t>k</w:t>
+      </w:r>
+      <w:r>
+        <w:rPr>
+          <w:b/>
+        </w:rPr>
+        <w:t>roczącej prognozy 1-krokowej naprzód</w:t>
       </w:r>
       <w:r>
         <w:t xml:space="preserve"> (rolling 1-step-ahead) dla lat 2015–2024 (n=10 obserwacji)</w:t>
@@ -310,7 +237,10 @@
         <w:pStyle w:val="Listapunktowana"/>
       </w:pPr>
       <w:r>
-        <w:t>Podejście to jest metodycznie poprawne — ocenia model na podstawie 10 niezależnych prognoz zamiast jedynie 2 punktów testowych</w:t>
+        <w:t>Podejście to jest metodycznie</w:t>
+      </w:r>
+      <w:r>
+        <w:t xml:space="preserve"> poprawne — ocenia model na podstawie 10 niezależnych prognoz zamiast jedynie 2 punktów testowych</w:t>
       </w:r>
     </w:p>
     <w:p>
@@ -484,7 +414,7 @@
           </w:tcPr>
           <w:p>
             <w:r>
-              <w:t>GUS / URE</w:t>
+              <w:t>GUS</w:t>
             </w:r>
           </w:p>
         </w:tc>
@@ -588,7 +518,7 @@
           </w:tcPr>
           <w:p>
             <w:r>
-              <w:t>URE / GUS</w:t>
+              <w:t>GUS</w:t>
             </w:r>
           </w:p>
         </w:tc>
@@ -640,7 +570,7 @@
           </w:tcPr>
           <w:p>
             <w:r>
-              <w:t>IMGW / Eurostat</w:t>
+              <w:t>Eurostat</w:t>
             </w:r>
           </w:p>
         </w:tc>
@@ -672,31 +602,10 @@
           </w:tcPr>
           <w:p>
             <w:r>
-              <w:t xml:space="preserve">Dochód rozp. </w:t>
-            </w:r>
-            <w:proofErr w:type="spellStart"/>
-            <w:r>
-              <w:t>na</w:t>
-            </w:r>
-            <w:proofErr w:type="spellEnd"/>
-            <w:r>
-              <w:t xml:space="preserve"> </w:t>
-            </w:r>
-            <w:proofErr w:type="spellStart"/>
-            <w:r>
-              <w:t>osobę</w:t>
-            </w:r>
-            <w:proofErr w:type="spellEnd"/>
-            <w:r>
-              <w:t xml:space="preserve"> w </w:t>
-            </w:r>
-            <w:proofErr w:type="spellStart"/>
-            <w:r>
-              <w:t>gosp</w:t>
-            </w:r>
-            <w:proofErr w:type="spellEnd"/>
-            <w:r>
-              <w:t>. Dom.</w:t>
+              <w:t>Dochód rozp. na osobę</w:t>
+            </w:r>
+            <w:r>
+              <w:t xml:space="preserve"> w gosp. Dom.</w:t>
             </w:r>
           </w:p>
         </w:tc>
@@ -852,7 +761,10 @@
           </w:tcPr>
           <w:p>
             <w:r>
-              <w:t>Pow. użytkowa mieszk. na os.</w:t>
+              <w:t xml:space="preserve">Pow. </w:t>
+            </w:r>
+            <w:r>
+              <w:t>użytkowa mieszk. na os.</w:t>
             </w:r>
           </w:p>
         </w:tc>
@@ -902,15 +814,7 @@
         <w:t>Uwaga:</w:t>
       </w:r>
       <w:r>
-        <w:t xml:space="preserve"> Zmienna CDD (stopniodni chłodnicze) została usunięta z modeli po uzyskaniu nieistotnego statystycznie </w:t>
-      </w:r>
-      <w:proofErr w:type="spellStart"/>
-      <w:r>
-        <w:t>współczynnika</w:t>
-      </w:r>
-      <w:proofErr w:type="spellEnd"/>
-      <w:r>
-        <w:t xml:space="preserve"> (p &gt; 0</w:t>
+        <w:t xml:space="preserve"> Zmienna CDD (stopniodni chłodnicze) została usunięta z modeli po uzyskaniu nieistotnego statystycznie współczynnika (p &gt; 0</w:t>
       </w:r>
       <w:r>
         <w:t>,</w:t>
@@ -919,23 +823,10 @@
         <w:t>0</w:t>
       </w:r>
       <w:r>
-        <w:t xml:space="preserve">5), co </w:t>
-      </w:r>
-      <w:proofErr w:type="spellStart"/>
-      <w:r>
-        <w:t>wskazuje</w:t>
-      </w:r>
-      <w:proofErr w:type="spellEnd"/>
-      <w:r>
-        <w:t xml:space="preserve"> </w:t>
-      </w:r>
-      <w:proofErr w:type="spellStart"/>
-      <w:r>
-        <w:t>na</w:t>
-      </w:r>
-      <w:proofErr w:type="spellEnd"/>
-      <w:r>
-        <w:t xml:space="preserve"> jej marginalną rolę w polskich warunkach klimatycznych.</w:t>
+        <w:t>5), co wskazuje na jej marginalną rolę w polskich warunkach klimaty</w:t>
+      </w:r>
+      <w:r>
+        <w:t>cznych.</w:t>
       </w:r>
     </w:p>
     <w:p>
@@ -1203,7 +1094,10 @@
           </w:tcPr>
           <w:p>
             <w:r>
-              <w:t>HDD [°C·dzień]</w:t>
+              <w:t xml:space="preserve">HDD </w:t>
+            </w:r>
+            <w:r>
+              <w:t>[°C·dzień]</w:t>
             </w:r>
           </w:p>
         </w:tc>
@@ -1288,7 +1182,10 @@
         <w:pStyle w:val="Listapunktowana"/>
       </w:pPr>
       <w:r>
-        <w:t>Cena energii wykazuje skok w 2022–2023 (kryzys energetyczny), osiągając 1,01 PLN/kWh</w:t>
+        <w:t>Cena energii wy</w:t>
+      </w:r>
+      <w:r>
+        <w:t>kazuje skok w 2022–2023 (kryzys energetyczny), osiągając 1,01 PLN/kWh</w:t>
       </w:r>
     </w:p>
     <w:p>
@@ -1314,7 +1211,10 @@
     </w:p>
     <w:p>
       <w:r>
-        <w:t>Dane obejmują 16 województw w latach 2004–2024. Zmienne objaśniające dla modelu FE różnią się od modelu Polska, gdyż dostępność danych jest odmienna na poziomie regionalnym:</w:t>
+        <w:t>Dane obejmują 16 woj</w:t>
+      </w:r>
+      <w:r>
+        <w:t>ewództw w latach 2004–2024. Zmienne objaśniające dla modelu FE różnią się od modelu Polska, gdyż dostępność danych jest odmienna na poziomie regionalnym:</w:t>
       </w:r>
     </w:p>
     <w:p>
@@ -1339,7 +1239,10 @@
         <w:pStyle w:val="Listapunktowana"/>
       </w:pPr>
       <w:r>
-        <w:t>Dodano zmienne strukturalne: urbanizację, przeciętną liczbę osób w gospodarstwie domowym oraz powierzchnię mieszkania na osobę</w:t>
+        <w:t>Dodano zmienne strukt</w:t>
+      </w:r>
+      <w:r>
+        <w:t>uralne: urbanizację, przeciętną liczbę osób w gospodarstwie domowym oraz powierzchnię mieszkania na osobę</w:t>
       </w:r>
     </w:p>
     <w:p>
@@ -1830,54 +1733,23 @@
       </m:oMathPara>
     </w:p>
     <w:p>
-      <w:proofErr w:type="spellStart"/>
       <w:r>
         <w:rPr>
           <w:b/>
         </w:rPr>
-        <w:t>Wyniki</w:t>
-      </w:r>
-      <w:proofErr w:type="spellEnd"/>
-      <w:r>
-        <w:rPr>
-          <w:b/>
-        </w:rPr>
-        <w:t xml:space="preserve"> </w:t>
-      </w:r>
-      <w:proofErr w:type="spellStart"/>
-      <w:r>
-        <w:rPr>
-          <w:b/>
-        </w:rPr>
-        <w:t>estymacji</w:t>
-      </w:r>
-      <w:proofErr w:type="spellEnd"/>
-      <w:r>
-        <w:rPr>
-          <w:b/>
-        </w:rPr>
-        <w:t xml:space="preserve"> (</w:t>
-      </w:r>
-      <w:proofErr w:type="spellStart"/>
+        <w:t>Wyniki estymacji (</w:t>
+      </w:r>
       <w:r>
         <w:rPr>
           <w:b/>
         </w:rPr>
         <w:t>zbiór</w:t>
       </w:r>
-      <w:proofErr w:type="spellEnd"/>
       <w:r>
         <w:rPr>
           <w:b/>
         </w:rPr>
-        <w:t xml:space="preserve"> </w:t>
-      </w:r>
-      <w:proofErr w:type="spellStart"/>
-      <w:r>
-        <w:rPr>
-          <w:b/>
-        </w:rPr>
-        <w:t>ucząc</w:t>
+        <w:t xml:space="preserve"> ucząc</w:t>
       </w:r>
       <w:r>
         <w:rPr>
@@ -1885,21 +1757,12 @@
         </w:rPr>
         <w:t>y</w:t>
       </w:r>
-      <w:proofErr w:type="spellEnd"/>
       <w:r>
         <w:rPr>
           <w:b/>
         </w:rPr>
-        <w:t xml:space="preserve">: </w:t>
-      </w:r>
-      <w:proofErr w:type="spellStart"/>
-      <w:r>
-        <w:rPr>
-          <w:b/>
-        </w:rPr>
-        <w:t>lata</w:t>
-      </w:r>
-      <w:proofErr w:type="spellEnd"/>
+        <w:t>: lata</w:t>
+      </w:r>
       <w:r>
         <w:rPr>
           <w:b/>
@@ -2216,7 +2079,10 @@
           </w:tcPr>
           <w:p>
             <w:r>
-              <w:t>−1,96×10⁻⁶</w:t>
+              <w:t>−</w:t>
+            </w:r>
+            <w:r>
+              <w:t>1,96×10⁻⁶</w:t>
             </w:r>
           </w:p>
         </w:tc>
@@ -2236,7 +2102,10 @@
           </w:tcPr>
           <w:p>
             <w:r>
-              <w:t>−0,05</w:t>
+              <w:t>−</w:t>
+            </w:r>
+            <w:r>
+              <w:t>0,05</w:t>
             </w:r>
           </w:p>
         </w:tc>
@@ -2374,7 +2243,10 @@
           </w:tcPr>
           <w:p>
             <w:r>
-              <w:t>−71,54</w:t>
+              <w:t>−</w:t>
+            </w:r>
+            <w:r>
+              <w:t>71,54</w:t>
             </w:r>
           </w:p>
         </w:tc>
@@ -2396,7 +2268,10 @@
           </w:tcPr>
           <w:p>
             <w:r>
-              <w:t>−67,76</w:t>
+              <w:t>−</w:t>
+            </w:r>
+            <w:r>
+              <w:t>67,76</w:t>
             </w:r>
           </w:p>
         </w:tc>
@@ -2432,19 +2307,9 @@
             <w:r>
               <w:t>RMSPE% (</w:t>
             </w:r>
-            <w:proofErr w:type="spellStart"/>
-            <w:r>
-              <w:t>próba</w:t>
-            </w:r>
-            <w:proofErr w:type="spellEnd"/>
-            <w:r>
-              <w:t xml:space="preserve"> </w:t>
-            </w:r>
-            <w:proofErr w:type="spellStart"/>
-            <w:r>
-              <w:t>ucząca</w:t>
-            </w:r>
-            <w:proofErr w:type="spellEnd"/>
+            <w:r>
+              <w:t>próba ucząca</w:t>
+            </w:r>
             <w:r>
               <w:t>)</w:t>
             </w:r>
@@ -2471,7 +2336,13 @@
               <w:rPr>
                 <w:b/>
               </w:rPr>
-              <w:t>RMSPE% rolling ex-post (2015–2024, n=10)</w:t>
+              <w:t xml:space="preserve">RMSPE% rolling ex-post </w:t>
+            </w:r>
+            <w:r>
+              <w:rPr>
+                <w:b/>
+              </w:rPr>
+              <w:t>(2015–2024, n=10)</w:t>
             </w:r>
           </w:p>
         </w:tc>
@@ -2514,24 +2385,14 @@
       <w:r>
         <w:t xml:space="preserve">Przyczyną jest </w:t>
       </w:r>
-      <w:proofErr w:type="spellStart"/>
       <w:r>
         <w:rPr>
           <w:b/>
         </w:rPr>
         <w:t>współliniowość</w:t>
       </w:r>
-      <w:proofErr w:type="spellEnd"/>
-      <w:r>
-        <w:t xml:space="preserve"> </w:t>
-      </w:r>
-      <w:proofErr w:type="spellStart"/>
-      <w:r>
-        <w:t>zmiennych</w:t>
-      </w:r>
-      <w:proofErr w:type="spellEnd"/>
-      <w:r>
-        <w:t>: VIF(</w:t>
+      <w:r>
+        <w:t xml:space="preserve"> zmiennych: VIF(</w:t>
       </w:r>
       <m:oMath>
         <m:r>
@@ -2613,7 +2474,25 @@
           <w:rPr>
             <w:rFonts w:ascii="Cambria Math" w:hAnsi="Cambria Math"/>
           </w:rPr>
-          <m:t>ln_CENA)</m:t>
+          <m:t>ln</m:t>
+        </m:r>
+        <m:r>
+          <w:rPr>
+            <w:rFonts w:ascii="Cambria Math" w:hAnsi="Cambria Math"/>
+          </w:rPr>
+          <m:t>_</m:t>
+        </m:r>
+        <m:r>
+          <w:rPr>
+            <w:rFonts w:ascii="Cambria Math" w:hAnsi="Cambria Math"/>
+          </w:rPr>
+          <m:t>CENA</m:t>
+        </m:r>
+        <m:r>
+          <w:rPr>
+            <w:rFonts w:ascii="Cambria Math" w:hAnsi="Cambria Math"/>
+          </w:rPr>
+          <m:t>)</m:t>
         </m:r>
       </m:oMath>
       <w:r>
@@ -2622,7 +2501,10 @@
     </w:p>
     <w:p>
       <w:r>
-        <w:t xml:space="preserve">  - PKB i CENA wykazują silne trendy wzrostowe w latach 2004–2024, co utrudnia separację efektów</w:t>
+        <w:t xml:space="preserve">  - PKB i CENA wykazują siln</w:t>
+      </w:r>
+      <w:r>
+        <w:t>e trendy wzrostowe w latach 2004–2024, co utrudnia separację efektów</w:t>
       </w:r>
     </w:p>
     <w:p>
@@ -2685,7 +2567,14 @@
                 <w:b/>
                 <w:color w:val="FFFFFF"/>
               </w:rPr>
-              <w:t>Wartość</w:t>
+              <w:t>Wart</w:t>
+            </w:r>
+            <w:r>
+              <w:rPr>
+                <w:b/>
+                <w:color w:val="FFFFFF"/>
+              </w:rPr>
+              <w:t>ość</w:t>
             </w:r>
           </w:p>
         </w:tc>
@@ -2731,35 +2620,9 @@
             <w:tcW w:w="3041" w:type="dxa"/>
           </w:tcPr>
           <w:p>
-            <w:proofErr w:type="spellStart"/>
-            <w:r>
-              <w:t>Podejrzenie</w:t>
-            </w:r>
-            <w:proofErr w:type="spellEnd"/>
-            <w:r>
-              <w:t xml:space="preserve"> </w:t>
-            </w:r>
-            <w:proofErr w:type="spellStart"/>
-            <w:r>
-              <w:t>złej</w:t>
-            </w:r>
-            <w:proofErr w:type="spellEnd"/>
-            <w:r>
-              <w:t xml:space="preserve"> </w:t>
-            </w:r>
-            <w:proofErr w:type="spellStart"/>
-            <w:r>
-              <w:t>specyfikacji</w:t>
-            </w:r>
-            <w:proofErr w:type="spellEnd"/>
-            <w:r>
-              <w:t xml:space="preserve"> </w:t>
-            </w:r>
-            <w:proofErr w:type="spellStart"/>
-            <w:r>
-              <w:t>modelu</w:t>
-            </w:r>
-            <w:proofErr w:type="spellEnd"/>
+            <w:r>
+              <w:t>Podejrzenie złej specyfikacji modelu</w:t>
+            </w:r>
           </w:p>
         </w:tc>
       </w:tr>
@@ -2854,7 +2717,10 @@
           </w:tcPr>
           <w:p>
             <w:r>
-              <w:t>Odrzucenie normalności (n=19, wrażliwy test)</w:t>
+              <w:t xml:space="preserve">Odrzucenie normalności (n=19, wrażliwy </w:t>
+            </w:r>
+            <w:r>
+              <w:t>test)</w:t>
             </w:r>
           </w:p>
         </w:tc>
@@ -2897,7 +2763,6 @@
       <w:pPr>
         <w:ind w:left="567"/>
       </w:pPr>
-      <w:proofErr w:type="spellStart"/>
       <w:r>
         <w:rPr>
           <w:b/>
@@ -2914,23 +2779,13 @@
         </w:rPr>
         <w:t>i</w:t>
       </w:r>
-      <w:proofErr w:type="spellEnd"/>
       <w:r>
         <w:rPr>
           <w:b/>
           <w:i/>
           <w:color w:val="444444"/>
         </w:rPr>
-        <w:t xml:space="preserve"> </w:t>
-      </w:r>
-      <w:proofErr w:type="spellStart"/>
-      <w:r>
-        <w:rPr>
-          <w:b/>
-          <w:i/>
-          <w:color w:val="444444"/>
-        </w:rPr>
-        <w:t>diagnostyczn</w:t>
+        <w:t xml:space="preserve"> diagnostyczn</w:t>
       </w:r>
       <w:r>
         <w:rPr>
@@ -2940,7 +2795,6 @@
         </w:rPr>
         <w:t>e</w:t>
       </w:r>
-      <w:proofErr w:type="spellEnd"/>
       <w:r>
         <w:rPr>
           <w:b/>
@@ -2962,159 +2816,7 @@
         </w:numPr>
       </w:pPr>
       <w:r>
-        <w:t xml:space="preserve">Test RESET </w:t>
-      </w:r>
-      <w:proofErr w:type="spellStart"/>
-      <w:r>
-        <w:t>przeprowadzono</w:t>
-      </w:r>
-      <w:proofErr w:type="spellEnd"/>
-      <w:r>
-        <w:t xml:space="preserve"> </w:t>
-      </w:r>
-      <w:proofErr w:type="spellStart"/>
-      <w:r>
-        <w:t>pomocniczo</w:t>
-      </w:r>
-      <w:proofErr w:type="spellEnd"/>
-      <w:r>
-        <w:t xml:space="preserve">, </w:t>
-      </w:r>
-      <w:proofErr w:type="spellStart"/>
-      <w:r>
-        <w:t>ponieważ</w:t>
-      </w:r>
-      <w:proofErr w:type="spellEnd"/>
-      <w:r>
-        <w:t xml:space="preserve"> </w:t>
-      </w:r>
-      <w:proofErr w:type="spellStart"/>
-      <w:r>
-        <w:t>próba</w:t>
-      </w:r>
-      <w:proofErr w:type="spellEnd"/>
-      <w:r>
-        <w:t xml:space="preserve"> </w:t>
-      </w:r>
-      <w:proofErr w:type="spellStart"/>
-      <w:r>
-        <w:t>estymacyjna</w:t>
-      </w:r>
-      <w:proofErr w:type="spellEnd"/>
-      <w:r>
-        <w:t xml:space="preserve"> </w:t>
-      </w:r>
-      <w:proofErr w:type="spellStart"/>
-      <w:r>
-        <w:t>obejmuje</w:t>
-      </w:r>
-      <w:proofErr w:type="spellEnd"/>
-      <w:r>
-        <w:t xml:space="preserve"> </w:t>
-      </w:r>
-      <w:proofErr w:type="spellStart"/>
-      <w:r>
-        <w:t>jedynie</w:t>
-      </w:r>
-      <w:proofErr w:type="spellEnd"/>
-      <w:r>
-        <w:t xml:space="preserve"> 19 </w:t>
-      </w:r>
-      <w:proofErr w:type="spellStart"/>
-      <w:r>
-        <w:t>obserwacji</w:t>
-      </w:r>
-      <w:proofErr w:type="spellEnd"/>
-      <w:r>
-        <w:t xml:space="preserve">. </w:t>
-      </w:r>
-      <w:proofErr w:type="spellStart"/>
-      <w:r>
-        <w:t>Wynik</w:t>
-      </w:r>
-      <w:proofErr w:type="spellEnd"/>
-      <w:r>
-        <w:t xml:space="preserve"> </w:t>
-      </w:r>
-      <w:proofErr w:type="spellStart"/>
-      <w:r>
-        <w:t>należy</w:t>
-      </w:r>
-      <w:proofErr w:type="spellEnd"/>
-      <w:r>
-        <w:t xml:space="preserve"> </w:t>
-      </w:r>
-      <w:proofErr w:type="spellStart"/>
-      <w:r>
-        <w:t>interpretować</w:t>
-      </w:r>
-      <w:proofErr w:type="spellEnd"/>
-      <w:r>
-        <w:t xml:space="preserve"> </w:t>
-      </w:r>
-      <w:proofErr w:type="spellStart"/>
-      <w:r>
-        <w:t>ostrożnie</w:t>
-      </w:r>
-      <w:proofErr w:type="spellEnd"/>
-      <w:r>
-        <w:t xml:space="preserve">, </w:t>
-      </w:r>
-      <w:proofErr w:type="spellStart"/>
-      <w:r>
-        <w:t>jako</w:t>
-      </w:r>
-      <w:proofErr w:type="spellEnd"/>
-      <w:r>
-        <w:t xml:space="preserve"> </w:t>
-      </w:r>
-      <w:proofErr w:type="spellStart"/>
-      <w:r>
-        <w:t>sygnał</w:t>
-      </w:r>
-      <w:proofErr w:type="spellEnd"/>
-      <w:r>
-        <w:t xml:space="preserve"> </w:t>
-      </w:r>
-      <w:proofErr w:type="spellStart"/>
-      <w:r>
-        <w:t>orientacyjny</w:t>
-      </w:r>
-      <w:proofErr w:type="spellEnd"/>
-      <w:r>
-        <w:t xml:space="preserve"> </w:t>
-      </w:r>
-      <w:proofErr w:type="spellStart"/>
-      <w:r>
-        <w:t>dotyczący</w:t>
-      </w:r>
-      <w:proofErr w:type="spellEnd"/>
-      <w:r>
-        <w:t xml:space="preserve"> </w:t>
-      </w:r>
-      <w:proofErr w:type="spellStart"/>
-      <w:r>
-        <w:t>możliwej</w:t>
-      </w:r>
-      <w:proofErr w:type="spellEnd"/>
-      <w:r>
-        <w:t xml:space="preserve"> </w:t>
-      </w:r>
-      <w:proofErr w:type="spellStart"/>
-      <w:r>
-        <w:t>niedospecyfikacji</w:t>
-      </w:r>
-      <w:proofErr w:type="spellEnd"/>
-      <w:r>
-        <w:t xml:space="preserve"> </w:t>
-      </w:r>
-      <w:proofErr w:type="spellStart"/>
-      <w:r>
-        <w:t>modelu</w:t>
-      </w:r>
-      <w:proofErr w:type="spellEnd"/>
-      <w:r>
-        <w:t>.</w:t>
+        <w:t>Test RESET przeprowadzono pomocniczo, ponieważ próba estymacyjna obejmuje jedynie 19 obserwacji. Wynik należy interpretować ostrożnie, jako sygnał orientacyjny dotyczący możliwej niedospecyfikacji modelu.</w:t>
       </w:r>
       <w:r>
         <w:rPr>
@@ -3132,45 +2834,8 @@
           <w:numId w:val="10"/>
         </w:numPr>
       </w:pPr>
-      <w:proofErr w:type="spellStart"/>
-      <w:r>
-        <w:t>Naruszenie</w:t>
-      </w:r>
-      <w:proofErr w:type="spellEnd"/>
-      <w:r>
-        <w:t xml:space="preserve"> </w:t>
-      </w:r>
-      <w:proofErr w:type="spellStart"/>
-      <w:r>
-        <w:t>założenia</w:t>
-      </w:r>
-      <w:proofErr w:type="spellEnd"/>
-      <w:r>
-        <w:t xml:space="preserve"> </w:t>
-      </w:r>
-      <w:proofErr w:type="spellStart"/>
-      <w:r>
-        <w:t>normalności</w:t>
-      </w:r>
-      <w:proofErr w:type="spellEnd"/>
-      <w:r>
-        <w:t xml:space="preserve"> </w:t>
-      </w:r>
-      <w:proofErr w:type="spellStart"/>
-      <w:r>
-        <w:t>reszt</w:t>
-      </w:r>
-      <w:proofErr w:type="spellEnd"/>
-      <w:r>
-        <w:t xml:space="preserve"> </w:t>
-      </w:r>
-      <w:proofErr w:type="spellStart"/>
-      <w:r>
-        <w:t>przy</w:t>
-      </w:r>
-      <w:proofErr w:type="spellEnd"/>
-      <w:r>
-        <w:t xml:space="preserve"> n=19 jest charakterystyczne dla makroekonomicznych szeregów czasowych z obserwacjami anomalnymi (kryzys 2008–2009, pandemia 2020–2021). </w:t>
+      <w:r>
+        <w:t xml:space="preserve">Naruszenie założenia normalności reszt przy n=19 jest charakterystyczne dla makroekonomicznych szeregów czasowych z obserwacjami anomalnymi (kryzys 2008–2009, pandemia 2020–2021). </w:t>
       </w:r>
     </w:p>
     <w:p>
@@ -3185,90 +2850,10 @@
         <w:t xml:space="preserve">DW </w:t>
       </w:r>
       <w:r>
-        <w:t>j</w:t>
-      </w:r>
-      <w:r>
-        <w:t xml:space="preserve">est </w:t>
-      </w:r>
-      <w:proofErr w:type="spellStart"/>
-      <w:r>
-        <w:t>niższe</w:t>
-      </w:r>
-      <w:proofErr w:type="spellEnd"/>
-      <w:r>
-        <w:t xml:space="preserve"> od 2, co </w:t>
-      </w:r>
-      <w:proofErr w:type="spellStart"/>
-      <w:r>
-        <w:t>może</w:t>
-      </w:r>
-      <w:proofErr w:type="spellEnd"/>
-      <w:r>
-        <w:t xml:space="preserve"> </w:t>
-      </w:r>
-      <w:proofErr w:type="spellStart"/>
-      <w:r>
-        <w:t>sugerować</w:t>
-      </w:r>
-      <w:proofErr w:type="spellEnd"/>
-      <w:r>
-        <w:t xml:space="preserve"> </w:t>
-      </w:r>
-      <w:proofErr w:type="spellStart"/>
-      <w:r>
-        <w:t>autokorelację</w:t>
-      </w:r>
-      <w:proofErr w:type="spellEnd"/>
-      <w:r>
-        <w:t xml:space="preserve">, </w:t>
-      </w:r>
-      <w:proofErr w:type="spellStart"/>
-      <w:r>
-        <w:t>jednak</w:t>
-      </w:r>
-      <w:proofErr w:type="spellEnd"/>
-      <w:r>
-        <w:t xml:space="preserve"> test BG </w:t>
-      </w:r>
-      <w:proofErr w:type="spellStart"/>
-      <w:r>
-        <w:t>nie</w:t>
-      </w:r>
-      <w:proofErr w:type="spellEnd"/>
-      <w:r>
-        <w:t xml:space="preserve"> </w:t>
-      </w:r>
-      <w:proofErr w:type="spellStart"/>
-      <w:r>
-        <w:t>potwierdza</w:t>
-      </w:r>
-      <w:proofErr w:type="spellEnd"/>
-      <w:r>
-        <w:t xml:space="preserve"> </w:t>
-      </w:r>
-      <w:proofErr w:type="spellStart"/>
-      <w:r>
-        <w:t>jej</w:t>
-      </w:r>
-      <w:proofErr w:type="spellEnd"/>
-      <w:r>
-        <w:t xml:space="preserve"> </w:t>
-      </w:r>
-      <w:proofErr w:type="spellStart"/>
-      <w:r>
-        <w:t>istotności</w:t>
-      </w:r>
-      <w:proofErr w:type="spellEnd"/>
-      <w:r>
-        <w:t xml:space="preserve"> </w:t>
-      </w:r>
-      <w:proofErr w:type="spellStart"/>
-      <w:r>
-        <w:t>statystycznej</w:t>
-      </w:r>
-      <w:proofErr w:type="spellEnd"/>
-      <w:r>
-        <w:t>. Model nadal pozostaje użyteczny prognostycznie (RMSPE% ≤ 10%).</w:t>
+        <w:t>jest niższe od 2, co może sugerować autokorelację, jednak test BG nie potwierdza jej istotności</w:t>
+      </w:r>
+      <w:r>
+        <w:t xml:space="preserve"> statystycznej. Model nadal pozostaje użyteczny prognostycznie (RMSPE% ≤ 10%).</w:t>
       </w:r>
     </w:p>
     <w:p>
@@ -3592,13 +3177,8 @@
       </m:oMathPara>
     </w:p>
     <w:p>
-      <w:proofErr w:type="spellStart"/>
-      <w:r>
-        <w:t>gdzie</w:t>
-      </w:r>
-      <w:proofErr w:type="spellEnd"/>
-      <w:r>
-        <w:t xml:space="preserve"> </w:t>
+      <w:r>
+        <w:t xml:space="preserve">gdzie </w:t>
       </w:r>
       <m:oMath>
         <m:sSub>
@@ -3629,31 +3209,7 @@
         </m:sSub>
       </m:oMath>
       <w:r>
-        <w:t xml:space="preserve"> to </w:t>
-      </w:r>
-      <w:proofErr w:type="spellStart"/>
-      <w:r>
-        <w:t>zmienne</w:t>
-      </w:r>
-      <w:proofErr w:type="spellEnd"/>
-      <w:r>
-        <w:t xml:space="preserve"> zero-</w:t>
-      </w:r>
-      <w:proofErr w:type="spellStart"/>
-      <w:r>
-        <w:t>jedynkowe</w:t>
-      </w:r>
-      <w:proofErr w:type="spellEnd"/>
-      <w:r>
-        <w:t xml:space="preserve"> </w:t>
-      </w:r>
-      <w:proofErr w:type="spellStart"/>
-      <w:r>
-        <w:t>dla</w:t>
-      </w:r>
-      <w:proofErr w:type="spellEnd"/>
-      <w:r>
-        <w:t xml:space="preserve"> województw (kategoria referencyjna: dolnośląskie).</w:t>
+        <w:t xml:space="preserve"> to zmienne zero-jedynkowe dla województw (kategoria referencyjna: dolnośląskie).</w:t>
       </w:r>
     </w:p>
     <w:p>
@@ -3676,7 +3232,10 @@
         <w:t>ln_dochod_os_lag1</w:t>
       </w:r>
       <w:r>
-        <w:t xml:space="preserve"> – logarytm dochodu na osobę z opóźnieniem o 1 rok (efekt z poprzedniego roku)</w:t>
+        <w:t xml:space="preserve"> – logarytm dochodu na osobę z opóźnieniem o 1 rok (efekt z </w:t>
+      </w:r>
+      <w:r>
+        <w:t>poprzedniego roku)</w:t>
       </w:r>
     </w:p>
     <w:p>
@@ -3811,7 +3370,14 @@
                 <w:b/>
                 <w:color w:val="FFFFFF"/>
               </w:rPr>
-              <w:t>Miara</w:t>
+              <w:t>M</w:t>
+            </w:r>
+            <w:r>
+              <w:rPr>
+                <w:b/>
+                <w:color w:val="FFFFFF"/>
+              </w:rPr>
+              <w:t>iara</w:t>
             </w:r>
           </w:p>
         </w:tc>
@@ -3936,7 +3502,10 @@
           </w:tcPr>
           <w:p>
             <w:r>
-              <w:t>−1 078 / −997</w:t>
+              <w:t>−</w:t>
+            </w:r>
+            <w:r>
+              <w:t>1 078 / −997</w:t>
             </w:r>
           </w:p>
         </w:tc>
@@ -3998,7 +3567,13 @@
               <w:rPr>
                 <w:b/>
               </w:rPr>
-              <w:t>RMSPE% rolling ex-post (2015–2024, n=160)</w:t>
+              <w:t xml:space="preserve">RMSPE% rolling </w:t>
+            </w:r>
+            <w:r>
+              <w:rPr>
+                <w:b/>
+              </w:rPr>
+              <w:t>ex-post (2015–2024, n=160)</w:t>
             </w:r>
           </w:p>
         </w:tc>
@@ -4127,27 +3702,9 @@
             <w:tcW w:w="3041" w:type="dxa"/>
           </w:tcPr>
           <w:p>
-            <w:proofErr w:type="spellStart"/>
-            <w:r>
-              <w:t>Sugestia</w:t>
-            </w:r>
-            <w:proofErr w:type="spellEnd"/>
-            <w:r>
-              <w:t xml:space="preserve"> </w:t>
-            </w:r>
-            <w:proofErr w:type="spellStart"/>
-            <w:r>
-              <w:t>błędnej</w:t>
-            </w:r>
-            <w:proofErr w:type="spellEnd"/>
-            <w:r>
-              <w:t xml:space="preserve"> </w:t>
-            </w:r>
-            <w:proofErr w:type="spellStart"/>
-            <w:r>
-              <w:t>specyfikacji</w:t>
-            </w:r>
-            <w:proofErr w:type="spellEnd"/>
+            <w:r>
+              <w:t>Sugestia błędnej specyfikacji</w:t>
+            </w:r>
           </w:p>
         </w:tc>
       </w:tr>
@@ -4285,41 +3842,13 @@
       <w:pPr>
         <w:ind w:left="567"/>
       </w:pPr>
-      <w:proofErr w:type="spellStart"/>
       <w:r>
         <w:rPr>
           <w:b/>
           <w:i/>
           <w:color w:val="444444"/>
         </w:rPr>
-        <w:t>Uwagi</w:t>
-      </w:r>
-      <w:proofErr w:type="spellEnd"/>
-      <w:r>
-        <w:rPr>
-          <w:b/>
-          <w:i/>
-          <w:color w:val="444444"/>
-        </w:rPr>
-        <w:t xml:space="preserve"> </w:t>
-      </w:r>
-      <w:proofErr w:type="spellStart"/>
-      <w:r>
-        <w:rPr>
-          <w:b/>
-          <w:i/>
-          <w:color w:val="444444"/>
-        </w:rPr>
-        <w:t>diagnostyczne</w:t>
-      </w:r>
-      <w:proofErr w:type="spellEnd"/>
-      <w:r>
-        <w:rPr>
-          <w:b/>
-          <w:i/>
-          <w:color w:val="444444"/>
-        </w:rPr>
-        <w:t>:</w:t>
+        <w:t>Uwagi diagnostyczne:</w:t>
       </w:r>
       <w:r>
         <w:t xml:space="preserve"> </w:t>
@@ -4334,136 +3863,14 @@
         </w:numPr>
       </w:pPr>
       <w:r>
-        <w:t xml:space="preserve">Test Ramsey RESET </w:t>
-      </w:r>
-      <w:proofErr w:type="spellStart"/>
-      <w:r>
-        <w:t>wskazuje</w:t>
-      </w:r>
-      <w:proofErr w:type="spellEnd"/>
-      <w:r>
-        <w:t xml:space="preserve"> </w:t>
-      </w:r>
-      <w:proofErr w:type="spellStart"/>
-      <w:r>
-        <w:t>na</w:t>
-      </w:r>
-      <w:proofErr w:type="spellEnd"/>
-      <w:r>
-        <w:t xml:space="preserve"> </w:t>
-      </w:r>
-      <w:proofErr w:type="spellStart"/>
-      <w:r>
-        <w:t>możliwość</w:t>
-      </w:r>
-      <w:proofErr w:type="spellEnd"/>
-      <w:r>
-        <w:t xml:space="preserve"> </w:t>
-      </w:r>
-      <w:proofErr w:type="spellStart"/>
-      <w:r>
-        <w:t>błędnej</w:t>
-      </w:r>
-      <w:proofErr w:type="spellEnd"/>
-      <w:r>
-        <w:t xml:space="preserve"> </w:t>
-      </w:r>
-      <w:proofErr w:type="spellStart"/>
-      <w:r>
-        <w:t>specyfikacji</w:t>
-      </w:r>
-      <w:proofErr w:type="spellEnd"/>
-      <w:r>
-        <w:t xml:space="preserve"> </w:t>
-      </w:r>
-      <w:proofErr w:type="spellStart"/>
-      <w:r>
-        <w:t>modelu</w:t>
-      </w:r>
-      <w:proofErr w:type="spellEnd"/>
-      <w:r>
-        <w:t xml:space="preserve"> (p = 0,0072)</w:t>
+        <w:t>Test Ramsey RESET wskazuje na możliwość błędnej specyfikacji modelu (p = 0,0072)</w:t>
       </w:r>
       <w:r>
         <w:t xml:space="preserve"> – w </w:t>
       </w:r>
-      <w:proofErr w:type="spellStart"/>
-      <w:r>
-        <w:t>przypadku</w:t>
-      </w:r>
-      <w:proofErr w:type="spellEnd"/>
-      <w:r>
-        <w:t xml:space="preserve"> </w:t>
-      </w:r>
-      <w:proofErr w:type="spellStart"/>
-      <w:r>
-        <w:t>modeli</w:t>
-      </w:r>
-      <w:proofErr w:type="spellEnd"/>
-      <w:r>
-        <w:t xml:space="preserve"> </w:t>
-      </w:r>
-      <w:proofErr w:type="spellStart"/>
-      <w:r>
-        <w:t>panelowych</w:t>
-      </w:r>
-      <w:proofErr w:type="spellEnd"/>
-      <w:r>
-        <w:t xml:space="preserve"> z </w:t>
-      </w:r>
-      <w:proofErr w:type="spellStart"/>
-      <w:r>
-        <w:t>efektami</w:t>
-      </w:r>
-      <w:proofErr w:type="spellEnd"/>
-      <w:r>
-        <w:t xml:space="preserve"> </w:t>
-      </w:r>
-      <w:proofErr w:type="spellStart"/>
-      <w:r>
-        <w:t>stałymi</w:t>
-      </w:r>
-      <w:proofErr w:type="spellEnd"/>
-      <w:r>
-        <w:t xml:space="preserve"> </w:t>
-      </w:r>
-      <w:proofErr w:type="spellStart"/>
-      <w:r>
-        <w:t>wynik</w:t>
-      </w:r>
-      <w:proofErr w:type="spellEnd"/>
-      <w:r>
-        <w:t xml:space="preserve"> ten </w:t>
-      </w:r>
-      <w:proofErr w:type="spellStart"/>
-      <w:r>
-        <w:t>należy</w:t>
-      </w:r>
-      <w:proofErr w:type="spellEnd"/>
-      <w:r>
-        <w:t xml:space="preserve"> </w:t>
-      </w:r>
-      <w:proofErr w:type="spellStart"/>
-      <w:r>
-        <w:t>jednak</w:t>
-      </w:r>
-      <w:proofErr w:type="spellEnd"/>
-      <w:r>
-        <w:t xml:space="preserve"> </w:t>
-      </w:r>
-      <w:proofErr w:type="spellStart"/>
-      <w:r>
-        <w:t>interpretować</w:t>
-      </w:r>
-      <w:proofErr w:type="spellEnd"/>
-      <w:r>
-        <w:t xml:space="preserve"> </w:t>
-      </w:r>
-      <w:proofErr w:type="spellStart"/>
-      <w:r>
-        <w:t>ostrożnie</w:t>
-      </w:r>
-      <w:proofErr w:type="spellEnd"/>
+      <w:r>
+        <w:t>przypadku modeli panelowych z efektami stałymi wynik ten należy jednak interpretować ostrożnie</w:t>
+      </w:r>
       <w:r>
         <w:t>.</w:t>
       </w:r>
@@ -4477,79 +3884,10 @@
         </w:numPr>
       </w:pPr>
       <w:r>
-        <w:t xml:space="preserve">W </w:t>
-      </w:r>
-      <w:proofErr w:type="spellStart"/>
-      <w:r>
-        <w:t>modelu</w:t>
-      </w:r>
-      <w:proofErr w:type="spellEnd"/>
-      <w:r>
-        <w:t xml:space="preserve"> </w:t>
-      </w:r>
-      <w:proofErr w:type="spellStart"/>
-      <w:r>
-        <w:t>panelowym</w:t>
-      </w:r>
-      <w:proofErr w:type="spellEnd"/>
-      <w:r>
-        <w:t xml:space="preserve"> </w:t>
-      </w:r>
-      <w:proofErr w:type="spellStart"/>
-      <w:r>
-        <w:t>autokorelacja</w:t>
-      </w:r>
-      <w:proofErr w:type="spellEnd"/>
-      <w:r>
-        <w:t xml:space="preserve"> </w:t>
-      </w:r>
-      <w:proofErr w:type="spellStart"/>
-      <w:r>
-        <w:t>i</w:t>
-      </w:r>
-      <w:proofErr w:type="spellEnd"/>
-      <w:r>
-        <w:t xml:space="preserve"> </w:t>
-      </w:r>
-      <w:proofErr w:type="spellStart"/>
-      <w:r>
-        <w:t>odrzucenie</w:t>
-      </w:r>
-      <w:proofErr w:type="spellEnd"/>
-      <w:r>
-        <w:t xml:space="preserve"> normalności są typowe i oczekiwane. Nie wpływają istotnie </w:t>
-      </w:r>
-      <w:proofErr w:type="spellStart"/>
-      <w:r>
-        <w:t>na</w:t>
-      </w:r>
-      <w:proofErr w:type="spellEnd"/>
-      <w:r>
-        <w:t xml:space="preserve"> </w:t>
-      </w:r>
-      <w:proofErr w:type="spellStart"/>
-      <w:r>
-        <w:t>użyteczność</w:t>
-      </w:r>
-      <w:proofErr w:type="spellEnd"/>
-      <w:r>
-        <w:t xml:space="preserve"> </w:t>
-      </w:r>
-      <w:proofErr w:type="spellStart"/>
-      <w:r>
-        <w:t>prognostyczną</w:t>
-      </w:r>
-      <w:proofErr w:type="spellEnd"/>
-      <w:r>
-        <w:t xml:space="preserve"> </w:t>
-      </w:r>
-      <w:proofErr w:type="spellStart"/>
-      <w:r>
-        <w:t>modelu</w:t>
-      </w:r>
-      <w:proofErr w:type="spellEnd"/>
-      <w:r>
-        <w:t>.</w:t>
+        <w:t>W modelu panelowym autokorelacja i odrzucenie normalności są typowe i oczekiwane. Nie wpływają istotnie n</w:t>
+      </w:r>
+      <w:r>
+        <w:t>a użyteczność prognostyczną modelu.</w:t>
       </w:r>
     </w:p>
     <w:p>
@@ -4579,49 +3917,7 @@
           <w:b/>
         </w:rPr>
         <w:lastRenderedPageBreak/>
-        <w:t>VIF (</w:t>
-      </w:r>
-      <w:proofErr w:type="spellStart"/>
-      <w:r>
-        <w:rPr>
-          <w:b/>
-        </w:rPr>
-        <w:t>tylko</w:t>
-      </w:r>
-      <w:proofErr w:type="spellEnd"/>
-      <w:r>
-        <w:rPr>
-          <w:b/>
-        </w:rPr>
-        <w:t xml:space="preserve"> </w:t>
-      </w:r>
-      <w:proofErr w:type="spellStart"/>
-      <w:r>
-        <w:rPr>
-          <w:b/>
-        </w:rPr>
-        <w:t>zmienne</w:t>
-      </w:r>
-      <w:proofErr w:type="spellEnd"/>
-      <w:r>
-        <w:rPr>
-          <w:b/>
-        </w:rPr>
-        <w:t xml:space="preserve"> </w:t>
-      </w:r>
-      <w:proofErr w:type="spellStart"/>
-      <w:r>
-        <w:rPr>
-          <w:b/>
-        </w:rPr>
-        <w:t>główne</w:t>
-      </w:r>
-      <w:proofErr w:type="spellEnd"/>
-      <w:r>
-        <w:rPr>
-          <w:b/>
-        </w:rPr>
-        <w:t>):</w:t>
+        <w:t>VIF (tylko zmienne główne):</w:t>
       </w:r>
     </w:p>
     <w:tbl>
@@ -4834,7 +4130,13 @@
         <w:rPr>
           <w:b/>
         </w:rPr>
-        <w:t>RMSPE% per województwo (krocząca walidacja 2015–2024, n=10 na woj.):</w:t>
+        <w:t xml:space="preserve">RMSPE% per </w:t>
+      </w:r>
+      <w:r>
+        <w:rPr>
+          <w:b/>
+        </w:rPr>
+        <w:t>województwo (krocząca walidacja 2015–2024, n=10 na woj.):</w:t>
       </w:r>
     </w:p>
     <w:tbl>
@@ -5422,7 +4724,10 @@
         <w:t>16/16 województw</w:t>
       </w:r>
       <w:r>
-        <w:t xml:space="preserve"> spełnia kryterium RMSPE% ≤ 10% przy kroczącej walidacji ex-post (2015–2024). Poprzednia ocena na 2-punktowym zbiorze testowym (2023–2024) zawyżała błędy dla województw doświadczających szoku cenowego energii w 2022–2023 r. (Dolnośląskie, Lubelskie, Podkarpackie).</w:t>
+        <w:t xml:space="preserve"> spełnia kryterium RMSPE% ≤ 10% przy kroczącej walidacji ex-post (2015–2024). Poprzednia ocena na 2-punktowym zbiorze testowym (2023–2024) zawyżała błędy dla województw doświadczających szoku cenowego energii w 2022–2023 r. (Dolnośląskie, Lubelskie, Podkar</w:t>
+      </w:r>
+      <w:r>
+        <w:t>packie).</w:t>
       </w:r>
     </w:p>
     <w:p>
@@ -5705,21 +5010,8 @@
           </w:tcPr>
           <w:p>
             <w:r>
-              <w:t xml:space="preserve">Model </w:t>
-            </w:r>
-            <w:proofErr w:type="spellStart"/>
-            <w:r>
-              <w:t>trendu</w:t>
-            </w:r>
-            <w:proofErr w:type="spellEnd"/>
-            <w:r>
-              <w:t xml:space="preserve"> </w:t>
-            </w:r>
-            <w:proofErr w:type="spellStart"/>
-            <w:r>
-              <w:t>wykładniczego</w:t>
-            </w:r>
-            <w:proofErr w:type="spellEnd"/>
+              <w:t>Model trendu wykładniczego</w:t>
+            </w:r>
           </w:p>
         </w:tc>
       </w:tr>
@@ -5850,7 +5142,10 @@
           </w:tcPr>
           <w:p>
             <w:r>
-              <w:t>PKB per capita [PLN/os]</w:t>
+              <w:t xml:space="preserve">PKB </w:t>
+            </w:r>
+            <w:r>
+              <w:t>per capita [PLN/os]</w:t>
             </w:r>
           </w:p>
         </w:tc>
@@ -5984,7 +5279,10 @@
         <w:t>Uwaga:</w:t>
       </w:r>
       <w:r>
-        <w:t xml:space="preserve"> Prognoza ceny energii przekracza kryterium RMSPE% (16,82%) ze względu na bezprecedensowy skok cen energii w 2022–2023 (kryzys energetyczny). Jest to oczekiwane ograniczenie modeli bazujących na danych historycznych w warunkach strukturalnych szoków zewnętrznych.</w:t>
+        <w:t xml:space="preserve"> Prognoza ceny energii przekracza kryterium RMSPE% (16,82%) ze względu na bezprecedensowy skok cen energii w 2022–2023 (kryzys energetyczny). Jest to oczekiwane ograniczenie modeli bazujących na danych historycznych w warunkach strukturalnych szoków zewnęt</w:t>
+      </w:r>
+      <w:r>
+        <w:t>rznych.</w:t>
       </w:r>
     </w:p>
     <w:p>
@@ -6192,7 +5490,10 @@
           </w:tcPr>
           <w:p>
             <w:r>
-              <w:t>Pow. mieszk. na os. [m²]</w:t>
+              <w:t xml:space="preserve">Pow. mieszk. na os. </w:t>
+            </w:r>
+            <w:r>
+              <w:t>[m²]</w:t>
             </w:r>
           </w:p>
         </w:tc>
@@ -6266,29 +5567,8 @@
       <w:r>
         <w:t xml:space="preserve"> Wysokie RMSPE% dla dochodu i ceny energii wynikają z kryzysu energetycznego 2022–2023. Zmienne strukturalne (urbanizacja, liczba osób, pow. mieszk.) prognozują się z bardzo małym błędem dzięki ich </w:t>
       </w:r>
-      <w:proofErr w:type="spellStart"/>
-      <w:r>
-        <w:t>niewielkiej</w:t>
-      </w:r>
-      <w:proofErr w:type="spellEnd"/>
-      <w:r>
-        <w:t xml:space="preserve"> </w:t>
-      </w:r>
-      <w:proofErr w:type="spellStart"/>
-      <w:r>
-        <w:t>zmienności</w:t>
-      </w:r>
-      <w:proofErr w:type="spellEnd"/>
-      <w:r>
-        <w:t xml:space="preserve"> w </w:t>
-      </w:r>
-      <w:proofErr w:type="spellStart"/>
-      <w:r>
-        <w:t>czasie</w:t>
-      </w:r>
-      <w:proofErr w:type="spellEnd"/>
-      <w:r>
-        <w:t>.</w:t>
+      <w:r>
+        <w:t>niewielkiej zmienności w czasie.</w:t>
       </w:r>
     </w:p>
     <w:p>
@@ -6337,7 +5617,10 @@
         <w:t>Prognoza zmiennych X</w:t>
       </w:r>
       <w:r>
-        <w:t xml:space="preserve"> (Zadanie 4) → wartości oczekiwane na 2025</w:t>
+        <w:t xml:space="preserve"> (Zadanie 4) → war</w:t>
+      </w:r>
+      <w:r>
+        <w:t>tości oczekiwane na 2025</w:t>
       </w:r>
     </w:p>
     <w:p>
@@ -6363,7 +5646,14 @@
           <w:rFonts w:ascii="Courier New" w:hAnsi="Courier New"/>
           <w:sz w:val="20"/>
         </w:rPr>
-        <w:t>ŷ₂₀₂₅ = exp(β̂₀ + β̂₁·ln(x̂₁) + β̂₂·ln(x̂₂) + β̂₃·x̂₃)</w:t>
+        <w:t>ŷ₂₀₂₅</w:t>
+      </w:r>
+      <w:r>
+        <w:rPr>
+          <w:rFonts w:ascii="Courier New" w:hAnsi="Courier New"/>
+          <w:sz w:val="20"/>
+        </w:rPr>
+        <w:t xml:space="preserve"> = exp(β̂₀ + β̂₁·ln(x̂₁) + β̂₂·ln(x̂₂) + β̂₃·x̂₃)</w:t>
       </w:r>
     </w:p>
     <w:p>
@@ -6918,23 +6208,7 @@
           <w:color w:val="1A5C96"/>
           <w:sz w:val="26"/>
         </w:rPr>
-        <w:t xml:space="preserve">5.3 </w:t>
-      </w:r>
-      <w:proofErr w:type="spellStart"/>
-      <w:r>
-        <w:rPr>
-          <w:color w:val="1A5C96"/>
-          <w:sz w:val="26"/>
-        </w:rPr>
-        <w:t>Wyniki</w:t>
-      </w:r>
-      <w:proofErr w:type="spellEnd"/>
-      <w:r>
-        <w:rPr>
-          <w:color w:val="1A5C96"/>
-          <w:sz w:val="26"/>
-        </w:rPr>
-        <w:t xml:space="preserve"> – Model FE (agregacja sumy 16 województw)</w:t>
+        <w:t>5.3 Wyniki – Model FE (agregacja sumy 16 województw)</w:t>
       </w:r>
     </w:p>
     <w:tbl>
@@ -7051,7 +6325,13 @@
         <w:rPr>
           <w:b/>
         </w:rPr>
-        <w:t>Wyniki per województwo (prognoza ex-ante 2025, RMSPE% z kroczącej walidacji 2015–2024):</w:t>
+        <w:t xml:space="preserve">Wyniki per województwo (prognoza ex-ante 2025, RMSPE% z </w:t>
+      </w:r>
+      <w:r>
+        <w:rPr>
+          <w:b/>
+        </w:rPr>
+        <w:t>kroczącej walidacji 2015–2024):</w:t>
       </w:r>
     </w:p>
     <w:tbl>
@@ -7074,7 +6354,6 @@
             <w:shd w:val="clear" w:color="auto" w:fill="1A5C96"/>
           </w:tcPr>
           <w:p>
-            <w:proofErr w:type="spellStart"/>
             <w:r>
               <w:rPr>
                 <w:b/>
@@ -7082,7 +6361,6 @@
               </w:rPr>
               <w:t>Województwo</w:t>
             </w:r>
-            <w:proofErr w:type="spellEnd"/>
           </w:p>
         </w:tc>
         <w:tc>
@@ -7091,21 +6369,12 @@
             <w:shd w:val="clear" w:color="auto" w:fill="1A5C96"/>
           </w:tcPr>
           <w:p>
-            <w:proofErr w:type="spellStart"/>
             <w:r>
               <w:rPr>
                 <w:b/>
                 <w:color w:val="FFFFFF"/>
               </w:rPr>
-              <w:t>Prognoza</w:t>
-            </w:r>
-            <w:proofErr w:type="spellEnd"/>
-            <w:r>
-              <w:rPr>
-                <w:b/>
-                <w:color w:val="FFFFFF"/>
-              </w:rPr>
-              <w:t xml:space="preserve"> 2025 [GWh]</w:t>
+              <w:t>Prognoza 2025 [GWh]</w:t>
             </w:r>
           </w:p>
         </w:tc>
@@ -7160,11 +6429,9 @@
             <w:tcW w:w="2218" w:type="dxa"/>
           </w:tcPr>
           <w:p>
-            <w:proofErr w:type="spellStart"/>
             <w:r>
               <w:t>Dolnośląskie</w:t>
             </w:r>
-            <w:proofErr w:type="spellEnd"/>
           </w:p>
         </w:tc>
         <w:tc>
@@ -7210,11 +6477,9 @@
             <w:tcW w:w="2218" w:type="dxa"/>
           </w:tcPr>
           <w:p>
-            <w:proofErr w:type="spellStart"/>
             <w:r>
               <w:t>Kujawsko-pomorskie</w:t>
             </w:r>
-            <w:proofErr w:type="spellEnd"/>
           </w:p>
         </w:tc>
         <w:tc>
@@ -7260,11 +6525,9 @@
             <w:tcW w:w="2218" w:type="dxa"/>
           </w:tcPr>
           <w:p>
-            <w:proofErr w:type="spellStart"/>
             <w:r>
               <w:t>Lubelskie</w:t>
             </w:r>
-            <w:proofErr w:type="spellEnd"/>
           </w:p>
         </w:tc>
         <w:tc>
@@ -7310,12 +6573,10 @@
             <w:tcW w:w="2218" w:type="dxa"/>
           </w:tcPr>
           <w:p>
-            <w:proofErr w:type="spellStart"/>
             <w:r>
               <w:lastRenderedPageBreak/>
               <w:t>Lubuskie</w:t>
             </w:r>
-            <w:proofErr w:type="spellEnd"/>
           </w:p>
         </w:tc>
         <w:tc>
@@ -7361,11 +6622,9 @@
             <w:tcW w:w="2218" w:type="dxa"/>
           </w:tcPr>
           <w:p>
-            <w:proofErr w:type="spellStart"/>
             <w:r>
               <w:t>Łódzkie</w:t>
             </w:r>
-            <w:proofErr w:type="spellEnd"/>
           </w:p>
         </w:tc>
         <w:tc>
@@ -7411,11 +6670,9 @@
             <w:tcW w:w="2218" w:type="dxa"/>
           </w:tcPr>
           <w:p>
-            <w:proofErr w:type="spellStart"/>
             <w:r>
               <w:t>Małopolskie</w:t>
             </w:r>
-            <w:proofErr w:type="spellEnd"/>
           </w:p>
         </w:tc>
         <w:tc>
@@ -7461,11 +6718,9 @@
             <w:tcW w:w="2218" w:type="dxa"/>
           </w:tcPr>
           <w:p>
-            <w:proofErr w:type="spellStart"/>
             <w:r>
               <w:t>Mazowieckie</w:t>
             </w:r>
-            <w:proofErr w:type="spellEnd"/>
           </w:p>
         </w:tc>
         <w:tc>
@@ -7511,11 +6766,9 @@
             <w:tcW w:w="2218" w:type="dxa"/>
           </w:tcPr>
           <w:p>
-            <w:proofErr w:type="spellStart"/>
             <w:r>
               <w:t>Opolskie</w:t>
             </w:r>
-            <w:proofErr w:type="spellEnd"/>
           </w:p>
         </w:tc>
         <w:tc>
@@ -7561,11 +6814,9 @@
             <w:tcW w:w="2218" w:type="dxa"/>
           </w:tcPr>
           <w:p>
-            <w:proofErr w:type="spellStart"/>
             <w:r>
               <w:t>Podkarpackie</w:t>
             </w:r>
-            <w:proofErr w:type="spellEnd"/>
           </w:p>
         </w:tc>
         <w:tc>
@@ -7611,11 +6862,9 @@
             <w:tcW w:w="2218" w:type="dxa"/>
           </w:tcPr>
           <w:p>
-            <w:proofErr w:type="spellStart"/>
             <w:r>
               <w:t>Podlaskie</w:t>
             </w:r>
-            <w:proofErr w:type="spellEnd"/>
           </w:p>
         </w:tc>
         <w:tc>
@@ -7661,11 +6910,9 @@
             <w:tcW w:w="2218" w:type="dxa"/>
           </w:tcPr>
           <w:p>
-            <w:proofErr w:type="spellStart"/>
             <w:r>
               <w:t>Pomorskie</w:t>
             </w:r>
-            <w:proofErr w:type="spellEnd"/>
           </w:p>
         </w:tc>
         <w:tc>
@@ -7711,11 +6958,9 @@
             <w:tcW w:w="2218" w:type="dxa"/>
           </w:tcPr>
           <w:p>
-            <w:proofErr w:type="spellStart"/>
             <w:r>
               <w:t>Śląskie</w:t>
             </w:r>
-            <w:proofErr w:type="spellEnd"/>
           </w:p>
         </w:tc>
         <w:tc>
@@ -7761,11 +7006,9 @@
             <w:tcW w:w="2218" w:type="dxa"/>
           </w:tcPr>
           <w:p>
-            <w:proofErr w:type="spellStart"/>
             <w:r>
               <w:t>Świętokrzyskie</w:t>
             </w:r>
-            <w:proofErr w:type="spellEnd"/>
           </w:p>
         </w:tc>
         <w:tc>
@@ -7811,11 +7054,9 @@
             <w:tcW w:w="2218" w:type="dxa"/>
           </w:tcPr>
           <w:p>
-            <w:proofErr w:type="spellStart"/>
             <w:r>
               <w:t>Warmińsko-mazurskie</w:t>
             </w:r>
-            <w:proofErr w:type="spellEnd"/>
           </w:p>
         </w:tc>
         <w:tc>
@@ -7861,11 +7102,9 @@
             <w:tcW w:w="2218" w:type="dxa"/>
           </w:tcPr>
           <w:p>
-            <w:proofErr w:type="spellStart"/>
             <w:r>
               <w:t>Wielkopolskie</w:t>
             </w:r>
-            <w:proofErr w:type="spellEnd"/>
           </w:p>
         </w:tc>
         <w:tc>
@@ -7911,11 +7150,9 @@
             <w:tcW w:w="2218" w:type="dxa"/>
           </w:tcPr>
           <w:p>
-            <w:proofErr w:type="spellStart"/>
             <w:r>
               <w:t>Zachodniopomorskie</w:t>
             </w:r>
-            <w:proofErr w:type="spellEnd"/>
           </w:p>
         </w:tc>
         <w:tc>
@@ -8205,7 +7442,10 @@
           </w:tcPr>
           <w:p>
             <w:r>
-              <w:t>FC 2025 [GWh]</w:t>
+              <w:t xml:space="preserve">FC </w:t>
+            </w:r>
+            <w:r>
+              <w:t>2025 [GWh]</w:t>
             </w:r>
           </w:p>
         </w:tc>
@@ -8263,7 +7503,10 @@
           </w:tcPr>
           <w:p>
             <w:r>
-              <w:t>−1 268 GWh (−4,0%)</w:t>
+              <w:t>−</w:t>
+            </w:r>
+            <w:r>
+              <w:t>1 268 GWh (−4,0%)</w:t>
             </w:r>
           </w:p>
         </w:tc>
@@ -8307,7 +7550,10 @@
     <w:p/>
     <w:p>
       <w:r>
-        <w:t>Oba modele spełniają kryterium RMSPE% ≤ 10%. Krocząca walidacja ex-post na 10 latach (2015–2024) pokazuje że modele działają konsekwentnie z błędem poniżej 6,3% rocznie. Model Polska jest prostszy, natomiast model FE dostarcza informacji na poziomie regionalnym.</w:t>
+        <w:t xml:space="preserve">Oba modele spełniają kryterium RMSPE% ≤ 10%. Krocząca walidacja ex-post na 10 latach (2015–2024) pokazuje że modele działają konsekwentnie z błędem poniżej 6,3% </w:t>
+      </w:r>
+      <w:r>
+        <w:t>rocznie. Model Polska jest prostszy, natomiast model FE dostarcza informacji na poziomie regionalnym.</w:t>
       </w:r>
     </w:p>
     <w:p>
@@ -8341,7 +7587,10 @@
     </w:p>
     <w:p>
       <w:r>
-        <w:t>Zużycie energii elektrycznej w Polsce w roku 2025 prognozowane jest na:</w:t>
+        <w:t>Zużycie energii elektrycznej w Polsce w roku 2025 prognoz</w:t>
+      </w:r>
+      <w:r>
+        <w:t>owane jest na:</w:t>
       </w:r>
     </w:p>
     <w:p>
@@ -8374,37 +7623,11 @@
     </w:p>
     <w:p>
       <w:r>
-        <w:t xml:space="preserve">Punktowe prognozy różnią się o ok. 4%, co jest akceptowalnym poziomem rozbieżności między modelami o </w:t>
-      </w:r>
-      <w:proofErr w:type="spellStart"/>
-      <w:r>
-        <w:t>różnej</w:t>
-      </w:r>
-      <w:proofErr w:type="spellEnd"/>
-      <w:r>
-        <w:t xml:space="preserve"> </w:t>
-      </w:r>
-      <w:proofErr w:type="spellStart"/>
-      <w:r>
-        <w:t>specyfikacji</w:t>
-      </w:r>
-      <w:proofErr w:type="spellEnd"/>
-      <w:r>
-        <w:t xml:space="preserve"> </w:t>
-      </w:r>
-      <w:proofErr w:type="spellStart"/>
-      <w:r>
-        <w:t>i</w:t>
-      </w:r>
-      <w:proofErr w:type="spellEnd"/>
-      <w:r>
-        <w:t xml:space="preserve"> </w:t>
-      </w:r>
-      <w:proofErr w:type="spellStart"/>
+        <w:t xml:space="preserve">Punktowe prognozy różnią się o ok. 4%, co jest akceptowalnym poziomem rozbieżności między modelami o różnej specyfikacji i </w:t>
+      </w:r>
       <w:r>
         <w:t>szczegółowości</w:t>
       </w:r>
-      <w:proofErr w:type="spellEnd"/>
       <w:r>
         <w:t>.</w:t>
       </w:r>
@@ -8447,37 +7670,14 @@
         <w:t>Ceny energii</w:t>
       </w:r>
       <w:r>
-        <w:t xml:space="preserve"> – wyższe ceny mogą hamować konsumpcję (β₂ &gt; 0, lecz statystycznie </w:t>
-      </w:r>
-      <w:proofErr w:type="spellStart"/>
-      <w:r>
-        <w:t>słaby</w:t>
-      </w:r>
-      <w:proofErr w:type="spellEnd"/>
-      <w:r>
-        <w:t xml:space="preserve"> </w:t>
-      </w:r>
-      <w:proofErr w:type="spellStart"/>
-      <w:r>
-        <w:t>sygnał</w:t>
-      </w:r>
-      <w:proofErr w:type="spellEnd"/>
-      <w:r>
-        <w:t xml:space="preserve"> </w:t>
-      </w:r>
-      <w:proofErr w:type="spellStart"/>
-      <w:r>
-        <w:t>przy</w:t>
-      </w:r>
-      <w:proofErr w:type="spellEnd"/>
-      <w:r>
-        <w:t xml:space="preserve"> </w:t>
-      </w:r>
-      <w:proofErr w:type="spellStart"/>
+        <w:t xml:space="preserve"> – wyższe ceny mogą hamować konsumpcję (β₂ &gt; 0, lecz statystycznie słaby sygnał prz</w:t>
+      </w:r>
+      <w:r>
+        <w:t xml:space="preserve">y </w:t>
+      </w:r>
       <w:r>
         <w:t>multikolinearności</w:t>
       </w:r>
-      <w:proofErr w:type="spellEnd"/>
       <w:r>
         <w:t>)</w:t>
       </w:r>
@@ -8533,14 +7733,16 @@
         <w:t>Kryzys cen energii 2022–2023</w:t>
       </w:r>
       <w:r>
-        <w:t xml:space="preserve"> – bezprecedensowy wzrost cen jest trudny do uchwycenia przez modele trendu; prognozy CENA mają RMSPE% ~17%</w:t>
+        <w:t xml:space="preserve"> – bezprece</w:t>
+      </w:r>
+      <w:r>
+        <w:t>densowy wzrost cen jest trudny do uchwycenia przez modele trendu; prognozy CENA mają RMSPE% ~17%</w:t>
       </w:r>
     </w:p>
     <w:p>
       <w:pPr>
         <w:pStyle w:val="Listapunktowana"/>
       </w:pPr>
-      <w:proofErr w:type="spellStart"/>
       <w:r>
         <w:rPr>
           <w:b/>
@@ -8553,17 +7755,8 @@
         </w:rPr>
         <w:t>earność</w:t>
       </w:r>
-      <w:proofErr w:type="spellEnd"/>
-      <w:r>
-        <w:t xml:space="preserve"> – PKB </w:t>
-      </w:r>
-      <w:proofErr w:type="spellStart"/>
-      <w:r>
-        <w:t>i</w:t>
-      </w:r>
-      <w:proofErr w:type="spellEnd"/>
-      <w:r>
-        <w:t xml:space="preserve"> CENA wykazują silne trendy, co utrudnia izolację ich wpływów (VIF ≈ 7–8), choć nie wpływa negatywnie na jakość prognoz zagregowanych</w:t>
+      <w:r>
+        <w:t xml:space="preserve"> – PKB i CENA wykazują silne trendy, co utrudnia izolację ich wpływów (VIF ≈ 7–8), choć nie wpływa negatywnie na jakość prognoz zagregowanych</w:t>
       </w:r>
     </w:p>
     <w:p>
@@ -8617,7 +7810,10 @@
         <w:t>kroczącej walidacji ex-post</w:t>
       </w:r>
       <w:r>
-        <w:t xml:space="preserve"> dla lat 2015–2024 (n=10 prognoz jednorokowych naprzód).</w:t>
+        <w:t xml:space="preserve"> dla lat 2015–2024 (n</w:t>
+      </w:r>
+      <w:r>
+        <w:t>=10 prognoz jednorokowych naprzód).</w:t>
       </w:r>
     </w:p>
     <w:tbl>
@@ -8737,7 +7933,10 @@
           </w:tcPr>
           <w:p>
             <w:r>
-              <w:t>✓ Spełnia kryterium</w:t>
+              <w:t>✓</w:t>
+            </w:r>
+            <w:r>
+              <w:t xml:space="preserve"> Spełnia kryterium</w:t>
             </w:r>
           </w:p>
         </w:tc>
@@ -8782,7 +7981,10 @@
           </w:tcPr>
           <w:p>
             <w:r>
-              <w:t>✓ Spełnia kryterium</w:t>
+              <w:t>✓</w:t>
+            </w:r>
+            <w:r>
+              <w:t xml:space="preserve"> Spełnia kryterium</w:t>
             </w:r>
           </w:p>
         </w:tc>
@@ -8794,7 +7996,13 @@
         <w:rPr>
           <w:b/>
         </w:rPr>
-        <w:t>Oba modele spełniają kryterium RMSPE% ≤ 10%. Wszystkie 16 województw spełnia kryterium indywidualnie (16/16).</w:t>
+        <w:t xml:space="preserve">Oba modele spełniają kryterium RMSPE% ≤ </w:t>
+      </w:r>
+      <w:r>
+        <w:rPr>
+          <w:b/>
+        </w:rPr>
+        <w:t>10%. Wszystkie 16 województw spełnia kryterium indywidualnie (16/16).</w:t>
       </w:r>
     </w:p>
     <w:p>
@@ -8903,7 +8111,10 @@
           </w:tcPr>
           <w:p>
             <w:r>
-              <w:t>Interaktywny dashboard Streamlit</w:t>
+              <w:t>Interaktywny dashboard Stre</w:t>
+            </w:r>
+            <w:r>
+              <w:t>amlit</w:t>
             </w:r>
           </w:p>
         </w:tc>
@@ -8928,22 +8139,12 @@
             <w:tcW w:w="4561" w:type="dxa"/>
           </w:tcPr>
           <w:p>
-            <w:proofErr w:type="spellStart"/>
-            <w:r>
-              <w:t>Skrypt</w:t>
-            </w:r>
-            <w:proofErr w:type="spellEnd"/>
-            <w:r>
-              <w:t xml:space="preserve"> </w:t>
-            </w:r>
-            <w:proofErr w:type="spellStart"/>
-            <w:r>
-              <w:t>uruchom</w:t>
+            <w:r>
+              <w:t>Skrypt uruchom</w:t>
             </w:r>
             <w:r>
               <w:t>iający</w:t>
             </w:r>
-            <w:proofErr w:type="spellEnd"/>
             <w:r>
               <w:t xml:space="preserve"> (CLI)</w:t>
             </w:r>
@@ -9154,7 +8355,10 @@
           </w:tcPr>
           <w:p>
             <w:r>
-              <w:t>Wykresy prognoz warunkowych Y</w:t>
+              <w:t xml:space="preserve">Wykresy prognoz </w:t>
+            </w:r>
+            <w:r>
+              <w:t>warunkowych Y</w:t>
             </w:r>
           </w:p>
         </w:tc>
@@ -9234,7 +8438,10 @@
     </w:p>
     <w:p>
       <w:r>
-        <w:t>────────────────────────────────────────────────────────────</w:t>
+        <w:t>────────────────────────────────────────────────────</w:t>
+      </w:r>
+      <w:r>
+        <w:t>────────</w:t>
       </w:r>
     </w:p>
     <w:p>
@@ -9271,7 +8478,10 @@
         <w:pStyle w:val="Listapunktowana"/>
       </w:pPr>
       <w:r>
-        <w:t>Relacja ekonomiczna między PKB a zużyciem energii ma charakter elastyczności stałej</w:t>
+        <w:t xml:space="preserve">Relacja ekonomiczna między PKB a zużyciem energii </w:t>
+      </w:r>
+      <w:r>
+        <w:t>ma charakter elastyczności stałej</w:t>
       </w:r>
     </w:p>
     <w:p>
@@ -9304,7 +8514,14 @@
           <w:color w:val="1A5C96"/>
           <w:sz w:val="26"/>
         </w:rPr>
-        <w:t>8.2 Efekty stałe (Fixed Effects)</w:t>
+        <w:t>8.2 Efekty stałe (Fix</w:t>
+      </w:r>
+      <w:r>
+        <w:rPr>
+          <w:color w:val="1A5C96"/>
+          <w:sz w:val="26"/>
+        </w:rPr>
+        <w:t>ed Effects)</w:t>
       </w:r>
     </w:p>
     <w:p>
@@ -9325,48 +8542,11 @@
         <w:pStyle w:val="Listapunktowana"/>
       </w:pPr>
       <w:r>
-        <w:t xml:space="preserve">Korelację nieobserwowalnych efektów indywidualnych z </w:t>
-      </w:r>
-      <w:proofErr w:type="spellStart"/>
-      <w:r>
-        <w:t>zmiennymi</w:t>
-      </w:r>
-      <w:proofErr w:type="spellEnd"/>
-      <w:r>
-        <w:t xml:space="preserve"> </w:t>
-      </w:r>
-      <w:proofErr w:type="spellStart"/>
-      <w:r>
-        <w:t>objaśniającymi</w:t>
-      </w:r>
-      <w:proofErr w:type="spellEnd"/>
-      <w:r>
-        <w:t xml:space="preserve"> </w:t>
-      </w:r>
-      <w:r>
-        <w:t xml:space="preserve">(argument </w:t>
-      </w:r>
-      <w:proofErr w:type="spellStart"/>
-      <w:r>
-        <w:t>analogiczny</w:t>
-      </w:r>
-      <w:proofErr w:type="spellEnd"/>
-      <w:r>
-        <w:t xml:space="preserve"> do </w:t>
-      </w:r>
-      <w:proofErr w:type="spellStart"/>
-      <w:r>
-        <w:t>testu</w:t>
-      </w:r>
-      <w:proofErr w:type="spellEnd"/>
-      <w:r>
-        <w:t xml:space="preserve"> </w:t>
-      </w:r>
-      <w:proofErr w:type="spellStart"/>
-      <w:r>
-        <w:t>Hausmana</w:t>
-      </w:r>
-      <w:proofErr w:type="spellEnd"/>
+        <w:t xml:space="preserve">Korelację nieobserwowalnych efektów indywidualnych z zmiennymi objaśniającymi </w:t>
+      </w:r>
+      <w:r>
+        <w:t>(argument analogiczny do testu Hausmana</w:t>
+      </w:r>
       <w:r>
         <w:t>)</w:t>
       </w:r>
@@ -9421,7 +8601,10 @@
         <w:pStyle w:val="Listapunktowana"/>
       </w:pPr>
       <w:r>
-        <w:t>Modeluje realny mechanizm transmisji: zmiana dochodów wpływa na decyzje energetyczne z opóźnieniem (zakup urządzeń, zmiana standardu mieszkaniowego)</w:t>
+        <w:t>Modeluje realny mechanizm transmisji: zm</w:t>
+      </w:r>
+      <w:r>
+        <w:t>iana dochodów wpływa na decyzje energetyczne z opóźnieniem (zakup urządzeń, zmiana standardu mieszkaniowego)</w:t>
       </w:r>
     </w:p>
     <w:p>
@@ -9448,37 +8631,13 @@
         <w:t>CDD (stopniodni chłodnicze)</w:t>
       </w:r>
       <w:r>
-        <w:t xml:space="preserve"> </w:t>
-      </w:r>
-      <w:proofErr w:type="spellStart"/>
-      <w:r>
-        <w:t>usunięte</w:t>
-      </w:r>
-      <w:proofErr w:type="spellEnd"/>
-      <w:r>
-        <w:t>: p &gt; 0,</w:t>
+        <w:t xml:space="preserve"> usunięte: p &gt; 0,</w:t>
       </w:r>
       <w:r>
         <w:t>0</w:t>
       </w:r>
       <w:r>
-        <w:t xml:space="preserve">5 w </w:t>
-      </w:r>
-      <w:proofErr w:type="spellStart"/>
-      <w:r>
-        <w:t>obu</w:t>
-      </w:r>
-      <w:proofErr w:type="spellEnd"/>
-      <w:r>
-        <w:t xml:space="preserve"> </w:t>
-      </w:r>
-      <w:proofErr w:type="spellStart"/>
-      <w:r>
-        <w:t>modelach</w:t>
-      </w:r>
-      <w:proofErr w:type="spellEnd"/>
-      <w:r>
-        <w:t xml:space="preserve"> — chłodzenie elektryczne ma marginalną rolę w Polsce</w:t>
+        <w:t>5 w obu modelach — chłodzenie elektryczne ma marginalną rolę w Polsce</w:t>
       </w:r>
     </w:p>
     <w:p>
@@ -9492,55 +8651,7 @@
         <w:t>Ludność</w:t>
       </w:r>
       <w:r>
-        <w:t xml:space="preserve"> </w:t>
-      </w:r>
-      <w:proofErr w:type="spellStart"/>
-      <w:r>
-        <w:t>nie</w:t>
-      </w:r>
-      <w:proofErr w:type="spellEnd"/>
-      <w:r>
-        <w:t xml:space="preserve"> </w:t>
-      </w:r>
-      <w:proofErr w:type="spellStart"/>
-      <w:r>
-        <w:t>uwzględniona</w:t>
-      </w:r>
-      <w:proofErr w:type="spellEnd"/>
-      <w:r>
-        <w:t xml:space="preserve"> </w:t>
-      </w:r>
-      <w:proofErr w:type="spellStart"/>
-      <w:r>
-        <w:t>jako</w:t>
-      </w:r>
-      <w:proofErr w:type="spellEnd"/>
-      <w:r>
-        <w:t xml:space="preserve"> </w:t>
-      </w:r>
-      <w:proofErr w:type="spellStart"/>
-      <w:r>
-        <w:t>regresor</w:t>
-      </w:r>
-      <w:proofErr w:type="spellEnd"/>
-      <w:r>
-        <w:t xml:space="preserve"> — </w:t>
-      </w:r>
-      <w:proofErr w:type="spellStart"/>
-      <w:r>
-        <w:t>silna</w:t>
-      </w:r>
-      <w:proofErr w:type="spellEnd"/>
-      <w:r>
-        <w:t xml:space="preserve"> </w:t>
-      </w:r>
-      <w:proofErr w:type="spellStart"/>
-      <w:r>
-        <w:t>korelacja</w:t>
-      </w:r>
-      <w:proofErr w:type="spellEnd"/>
-      <w:r>
-        <w:t xml:space="preserve"> z PKB (VIF &gt; 15), nie poprawia jakości prognoz</w:t>
+        <w:t xml:space="preserve"> nie uwzględniona jako regresor — silna korelacja z PKB (VIF &gt; 15), nie poprawia jakości prognoz</w:t>
       </w:r>
     </w:p>
     <w:p>
@@ -9559,7 +8670,10 @@
     </w:p>
     <w:p>
       <w:r>
-        <w:t>────────────────────────────────────────────────────────────</w:t>
+        <w:t>───────</w:t>
+      </w:r>
+      <w:r>
+        <w:t>─────────────────────────────────────────────────────</w:t>
       </w:r>
     </w:p>
     <w:p>
@@ -9578,7 +8692,7 @@
 </file>
 
 <file path=word/numbering.xml><?xml version="1.0" encoding="utf-8"?>
-<w:numbering xmlns:wpc="http://schemas.microsoft.com/office/word/2010/wordprocessingCanvas" xmlns:cx="http://schemas.microsoft.com/office/drawing/2014/chartex" xmlns:cx1="http://schemas.microsoft.com/office/drawing/2015/9/8/chartex" xmlns:cx2="http://schemas.microsoft.com/office/drawing/2015/10/21/chartex" xmlns:cx3="http://schemas.microsoft.com/office/drawing/2016/5/9/chartex" xmlns:cx4="http://schemas.microsoft.com/office/drawing/2016/5/10/chartex" xmlns:cx5="http://schemas.microsoft.com/office/drawing/2016/5/11/chartex" xmlns:cx6="http://schemas.microsoft.com/office/drawing/2016/5/12/chartex" xmlns:cx7="http://schemas.microsoft.com/office/drawing/2016/5/13/chartex" xmlns:cx8="http://schemas.microsoft.com/office/drawing/2016/5/14/chartex" xmlns:mc="http://schemas.openxmlformats.org/markup-compatibility/2006" xmlns:aink="http://schemas.microsoft.com/office/drawing/2016/ink" xmlns:am3d="http://schemas.microsoft.com/office/drawing/2017/model3d" xmlns:o="urn:schemas-microsoft-com:office:office" xmlns:oel="http://schemas.microsoft.com/office/2019/extlst" xmlns:r="http://schemas.openxmlformats.org/officeDocument/2006/relationships" xmlns:m="http://schemas.openxmlformats.org/officeDocument/2006/math" xmlns:v="urn:schemas-microsoft-com:vml" xmlns:wp14="http://schemas.microsoft.com/office/word/2010/wordprocessingDrawing" xmlns:wp="http://schemas.openxmlformats.org/drawingml/2006/wordprocessingDrawing" xmlns:w10="urn:schemas-microsoft-com:office:word" xmlns:w="http://schemas.openxmlformats.org/wordprocessingml/2006/main" xmlns:w14="http://schemas.microsoft.com/office/word/2010/wordml" xmlns:w15="http://schemas.microsoft.com/office/word/2012/wordml" xmlns:w16cex="http://schemas.microsoft.com/office/word/2018/wordml/cex" xmlns:w16cid="http://schemas.microsoft.com/office/word/2016/wordml/cid" xmlns:w16="http://schemas.microsoft.com/office/word/2018/wordml" xmlns:w16sdtdh="http://schemas.microsoft.com/office/word/2020/wordml/sdtdatahash" xmlns:w16se="http://schemas.microsoft.com/office/word/2015/wordml/symex" xmlns:wpg="http://schemas.microsoft.com/office/word/2010/wordprocessingGroup" xmlns:wpi="http://schemas.microsoft.com/office/word/2010/wordprocessingInk" xmlns:wne="http://schemas.microsoft.com/office/word/2006/wordml" xmlns:wps="http://schemas.microsoft.com/office/word/2010/wordprocessingShape" mc:Ignorable="w14 w15 w16se w16cid w16 w16cex w16sdtdh wp14">
+<w:numbering xmlns:wpc="http://schemas.microsoft.com/office/word/2010/wordprocessingCanvas" xmlns:cx="http://schemas.microsoft.com/office/drawing/2014/chartex" xmlns:cx1="http://schemas.microsoft.com/office/drawing/2015/9/8/chartex" xmlns:cx2="http://schemas.microsoft.com/office/drawing/2015/10/21/chartex" xmlns:cx3="http://schemas.microsoft.com/office/drawing/2016/5/9/chartex" xmlns:cx4="http://schemas.microsoft.com/office/drawing/2016/5/10/chartex" xmlns:cx5="http://schemas.microsoft.com/office/drawing/2016/5/11/chartex" xmlns:cx6="http://schemas.microsoft.com/office/drawing/2016/5/12/chartex" xmlns:cx7="http://schemas.microsoft.com/office/drawing/2016/5/13/chartex" xmlns:cx8="http://schemas.microsoft.com/office/drawing/2016/5/14/chartex" xmlns:mc="http://schemas.openxmlformats.org/markup-compatibility/2006" xmlns:aink="http://schemas.microsoft.com/office/drawing/2016/ink" xmlns:am3d="http://schemas.microsoft.com/office/drawing/2017/model3d" xmlns:o="urn:schemas-microsoft-com:office:office" xmlns:r="http://schemas.openxmlformats.org/officeDocument/2006/relationships" xmlns:m="http://schemas.openxmlformats.org/officeDocument/2006/math" xmlns:v="urn:schemas-microsoft-com:vml" xmlns:wp14="http://schemas.microsoft.com/office/word/2010/wordprocessingDrawing" xmlns:wp="http://schemas.openxmlformats.org/drawingml/2006/wordprocessingDrawing" xmlns:w10="urn:schemas-microsoft-com:office:word" xmlns:w="http://schemas.openxmlformats.org/wordprocessingml/2006/main" xmlns:w14="http://schemas.microsoft.com/office/word/2010/wordml" xmlns:w15="http://schemas.microsoft.com/office/word/2012/wordml" xmlns:w16cex="http://schemas.microsoft.com/office/word/2018/wordml/cex" xmlns:w16cid="http://schemas.microsoft.com/office/word/2016/wordml/cid" xmlns:w16="http://schemas.microsoft.com/office/word/2018/wordml" xmlns:w16sdtdh="http://schemas.microsoft.com/office/word/2020/wordml/sdtdatahash" xmlns:w16se="http://schemas.microsoft.com/office/word/2015/wordml/symex" xmlns:wpg="http://schemas.microsoft.com/office/word/2010/wordprocessingGroup" xmlns:wpi="http://schemas.microsoft.com/office/word/2010/wordprocessingInk" xmlns:wne="http://schemas.microsoft.com/office/word/2006/wordml" xmlns:wps="http://schemas.microsoft.com/office/word/2010/wordprocessingShape" mc:Ignorable="w14 w15 w16se w16cid w16 w16cex w16sdtdh wp14">
   <w:abstractNum w:abstractNumId="0" w15:restartNumberingAfterBreak="0">
     <w:nsid w:val="FFFFFF7C"/>
     <w:multiLevelType w:val="singleLevel"/>
@@ -9976,37 +9090,37 @@
       </w:rPr>
     </w:lvl>
   </w:abstractNum>
-  <w:num w:numId="1" w16cid:durableId="890532162">
+  <w:num w:numId="1">
     <w:abstractNumId w:val="8"/>
   </w:num>
-  <w:num w:numId="2" w16cid:durableId="1120606037">
+  <w:num w:numId="2">
     <w:abstractNumId w:val="6"/>
   </w:num>
-  <w:num w:numId="3" w16cid:durableId="1996369321">
+  <w:num w:numId="3">
     <w:abstractNumId w:val="5"/>
   </w:num>
-  <w:num w:numId="4" w16cid:durableId="81335650">
+  <w:num w:numId="4">
     <w:abstractNumId w:val="4"/>
   </w:num>
-  <w:num w:numId="5" w16cid:durableId="558900344">
+  <w:num w:numId="5">
     <w:abstractNumId w:val="7"/>
   </w:num>
-  <w:num w:numId="6" w16cid:durableId="257325368">
+  <w:num w:numId="6">
     <w:abstractNumId w:val="3"/>
   </w:num>
-  <w:num w:numId="7" w16cid:durableId="664820418">
+  <w:num w:numId="7">
     <w:abstractNumId w:val="2"/>
   </w:num>
-  <w:num w:numId="8" w16cid:durableId="2066949403">
+  <w:num w:numId="8">
     <w:abstractNumId w:val="1"/>
   </w:num>
-  <w:num w:numId="9" w16cid:durableId="1229920908">
+  <w:num w:numId="9">
     <w:abstractNumId w:val="0"/>
   </w:num>
-  <w:num w:numId="10" w16cid:durableId="400712885">
+  <w:num w:numId="10">
     <w:abstractNumId w:val="9"/>
   </w:num>
-  <w:num w:numId="11" w16cid:durableId="171454262">
+  <w:num w:numId="11">
     <w:abstractNumId w:val="10"/>
   </w:num>
 </w:numbering>
@@ -10618,6 +9732,7 @@
   <w:style w:type="character" w:default="1" w:styleId="Domylnaczcionkaakapitu">
     <w:name w:val="Default Paragraph Font"/>
     <w:uiPriority w:val="1"/>
+    <w:semiHidden/>
     <w:unhideWhenUsed/>
   </w:style>
   <w:style w:type="table" w:default="1" w:styleId="Standardowy">

</xml_diff>